<commit_message>
Shuffle MCQ options (answers were all A or B), point Unit 10's closing to Unit 11 and the labs, list labs and assessment files on Downloads
Co-Authored-By: Claude Sonnet 5.5 <noreply@anthropic.com>
</commit_message>
<xml_diff>
--- a/downloads/assessment/assessment-bank.docx
+++ b/downloads/assessment/assessment-bank.docx
@@ -144,7 +144,7 @@
         </w:numPr>
       </w:pPr>
       <w:r>
-        <w:t xml:space="preserve">A variational autoencoder</w:t>
+        <w:t xml:space="preserve">A k-nearest-neighbour classifier</w:t>
       </w:r>
     </w:p>
     <w:p>
@@ -165,7 +165,7 @@
         </w:numPr>
       </w:pPr>
       <w:r>
-        <w:t xml:space="preserve">A support-vector machine</w:t>
+        <w:t xml:space="preserve">A variational autoencoder</w:t>
       </w:r>
     </w:p>
     <w:p>
@@ -186,7 +186,7 @@
         </w:numPr>
       </w:pPr>
       <w:r>
-        <w:t xml:space="preserve">A k-nearest-neighbour classifier</w:t>
+        <w:t xml:space="preserve">A support-vector machine</w:t>
       </w:r>
     </w:p>
     <w:p>
@@ -204,7 +204,7 @@
         <w:t xml:space="preserve"> </w:t>
       </w:r>
       <w:r>
-        <w:t xml:space="preserve">B. A VAE models p(x) (through a latent variable); the others model p(y|x) or a decision boundary.</w:t>
+        <w:t xml:space="preserve">C. A VAE models p(x) (through a latent variable); the others model p(y|x) or a decision boundary.</w:t>
       </w:r>
     </w:p>
     <w:p>
@@ -345,7 +345,7 @@
         </w:numPr>
       </w:pPr>
       <w:r>
-        <w:t xml:space="preserve">Reconstruct real images</w:t>
+        <w:t xml:space="preserve">Predict the next token</w:t>
       </w:r>
     </w:p>
     <w:p>
@@ -366,7 +366,7 @@
         </w:numPr>
       </w:pPr>
       <w:r>
-        <w:t xml:space="preserve">Tell real samples from generated ones</w:t>
+        <w:t xml:space="preserve">Maximise the likelihood of the data</w:t>
       </w:r>
     </w:p>
     <w:p>
@@ -387,7 +387,7 @@
         </w:numPr>
       </w:pPr>
       <w:r>
-        <w:t xml:space="preserve">Maximise the likelihood of the data</w:t>
+        <w:t xml:space="preserve">Tell real samples from generated ones</w:t>
       </w:r>
     </w:p>
     <w:p>
@@ -408,7 +408,7 @@
         </w:numPr>
       </w:pPr>
       <w:r>
-        <w:t xml:space="preserve">Predict the next token</w:t>
+        <w:t xml:space="preserve">Reconstruct real images</w:t>
       </w:r>
     </w:p>
     <w:p>
@@ -426,7 +426,7 @@
         <w:t xml:space="preserve"> </w:t>
       </w:r>
       <w:r>
-        <w:t xml:space="preserve">B.</w:t>
+        <w:t xml:space="preserve">C.</w:t>
       </w:r>
     </w:p>
     <w:p>
@@ -796,7 +796,7 @@
         </w:numPr>
       </w:pPr>
       <w:r>
-        <w:t xml:space="preserve">Attention is unchanged if the tokens are permuted, so order must be injected</w:t>
+        <w:t xml:space="preserve">The softmax needs positive inputs</w:t>
       </w:r>
     </w:p>
     <w:p>
@@ -817,7 +817,7 @@
         </w:numPr>
       </w:pPr>
       <w:r>
-        <w:t xml:space="preserve">Embeddings are too small</w:t>
+        <w:t xml:space="preserve">It reduces the parameter count</w:t>
       </w:r>
     </w:p>
     <w:p>
@@ -838,7 +838,7 @@
         </w:numPr>
       </w:pPr>
       <w:r>
-        <w:t xml:space="preserve">The softmax needs positive inputs</w:t>
+        <w:t xml:space="preserve">Attention is unchanged if the tokens are permuted, so order must be injected</w:t>
       </w:r>
     </w:p>
     <w:p>
@@ -859,7 +859,7 @@
         </w:numPr>
       </w:pPr>
       <w:r>
-        <w:t xml:space="preserve">It reduces the parameter count</w:t>
+        <w:t xml:space="preserve">Embeddings are too small</w:t>
       </w:r>
     </w:p>
     <w:p>
@@ -877,7 +877,7 @@
         <w:t xml:space="preserve"> </w:t>
       </w:r>
       <w:r>
-        <w:t xml:space="preserve">A.</w:t>
+        <w:t xml:space="preserve">C.</w:t>
       </w:r>
     </w:p>
     <w:p>
@@ -1028,7 +1028,7 @@
         </w:numPr>
       </w:pPr>
       <w:r>
-        <w:t xml:space="preserve">The p most likely tokens</w:t>
+        <w:t xml:space="preserve">Tokens with probability below p</w:t>
       </w:r>
     </w:p>
     <w:p>
@@ -1070,7 +1070,7 @@
         </w:numPr>
       </w:pPr>
       <w:r>
-        <w:t xml:space="preserve">Tokens with probability below p</w:t>
+        <w:t xml:space="preserve">A random fraction p of the vocabulary</w:t>
       </w:r>
     </w:p>
     <w:p>
@@ -1091,7 +1091,7 @@
         </w:numPr>
       </w:pPr>
       <w:r>
-        <w:t xml:space="preserve">A random fraction p of the vocabulary</w:t>
+        <w:t xml:space="preserve">The p most likely tokens</w:t>
       </w:r>
     </w:p>
     <w:p>
@@ -1306,7 +1306,7 @@
         </w:numPr>
       </w:pPr>
       <w:r>
-        <w:t xml:space="preserve">Fine-tunes the model</w:t>
+        <w:t xml:space="preserve">Includes worked examples in the prompt</w:t>
       </w:r>
     </w:p>
     <w:p>
@@ -1327,7 +1327,7 @@
         </w:numPr>
       </w:pPr>
       <w:r>
-        <w:t xml:space="preserve">Includes worked examples in the prompt</w:t>
+        <w:t xml:space="preserve">Fine-tunes the model</w:t>
       </w:r>
     </w:p>
     <w:p>
@@ -1387,7 +1387,7 @@
         <w:t xml:space="preserve"> </w:t>
       </w:r>
       <w:r>
-        <w:t xml:space="preserve">B.</w:t>
+        <w:t xml:space="preserve">A.</w:t>
       </w:r>
     </w:p>
     <w:p>
@@ -1630,7 +1630,7 @@
         </w:numPr>
       </w:pPr>
       <w:r>
-        <w:t xml:space="preserve">The query and document share exact rare words</w:t>
+        <w:t xml:space="preserve">The corpus has no text</w:t>
       </w:r>
     </w:p>
     <w:p>
@@ -1651,7 +1651,7 @@
         </w:numPr>
       </w:pPr>
       <w:r>
-        <w:t xml:space="preserve">The query is a paraphrase with no shared words</w:t>
+        <w:t xml:space="preserve">The query and document share exact rare words</w:t>
       </w:r>
     </w:p>
     <w:p>
@@ -1672,7 +1672,7 @@
         </w:numPr>
       </w:pPr>
       <w:r>
-        <w:t xml:space="preserve">The documents are images</w:t>
+        <w:t xml:space="preserve">The query is a paraphrase with no shared words</w:t>
       </w:r>
     </w:p>
     <w:p>
@@ -1693,7 +1693,7 @@
         </w:numPr>
       </w:pPr>
       <w:r>
-        <w:t xml:space="preserve">The corpus has no text</w:t>
+        <w:t xml:space="preserve">The documents are images</w:t>
       </w:r>
     </w:p>
     <w:p>
@@ -1711,7 +1711,7 @@
         <w:t xml:space="preserve"> </w:t>
       </w:r>
       <w:r>
-        <w:t xml:space="preserve">A.</w:t>
+        <w:t xml:space="preserve">B.</w:t>
       </w:r>
     </w:p>
     <w:p>
@@ -1963,7 +1963,7 @@
         </w:numPr>
       </w:pPr>
       <w:r>
-        <w:t xml:space="preserve">In 4-bit precision</w:t>
+        <w:t xml:space="preserve">In a vector database</w:t>
       </w:r>
     </w:p>
     <w:p>
@@ -2005,7 +2005,7 @@
         </w:numPr>
       </w:pPr>
       <w:r>
-        <w:t xml:space="preserve">In a vector database</w:t>
+        <w:t xml:space="preserve">In 4-bit precision</w:t>
       </w:r>
     </w:p>
     <w:p>
@@ -2044,7 +2044,7 @@
         <w:t xml:space="preserve"> </w:t>
       </w:r>
       <w:r>
-        <w:t xml:space="preserve">A.</w:t>
+        <w:t xml:space="preserve">C.</w:t>
       </w:r>
     </w:p>
     <w:p>
@@ -2333,7 +2333,7 @@
         </w:numPr>
       </w:pPr>
       <w:r>
-        <w:t xml:space="preserve">Close in a shared embedding space and non-matching pairs far apart</w:t>
+        <w:t xml:space="preserve">Share the same tokenizer</w:t>
       </w:r>
     </w:p>
     <w:p>
@@ -2375,7 +2375,7 @@
         </w:numPr>
       </w:pPr>
       <w:r>
-        <w:t xml:space="preserve">Share the same tokenizer</w:t>
+        <w:t xml:space="preserve">Have the same length</w:t>
       </w:r>
     </w:p>
     <w:p>
@@ -2396,7 +2396,7 @@
         </w:numPr>
       </w:pPr>
       <w:r>
-        <w:t xml:space="preserve">Have the same length</w:t>
+        <w:t xml:space="preserve">Close in a shared embedding space and non-matching pairs far apart</w:t>
       </w:r>
     </w:p>
     <w:p>
@@ -2414,7 +2414,7 @@
         <w:t xml:space="preserve"> </w:t>
       </w:r>
       <w:r>
-        <w:t xml:space="preserve">A. A contrastive loss over a batch.</w:t>
+        <w:t xml:space="preserve">D. A contrastive loss over a batch.</w:t>
       </w:r>
     </w:p>
     <w:p>
@@ -2586,7 +2586,7 @@
         </w:numPr>
       </w:pPr>
       <w:r>
-        <w:t xml:space="preserve">Reasoning, choosing an action (tool call), and reading the observation</w:t>
+        <w:t xml:space="preserve">Retrieval and chunking</w:t>
       </w:r>
     </w:p>
     <w:p>
@@ -2628,7 +2628,7 @@
         </w:numPr>
       </w:pPr>
       <w:r>
-        <w:t xml:space="preserve">Retrieval and chunking</w:t>
+        <w:t xml:space="preserve">Reasoning, choosing an action (tool call), and reading the observation</w:t>
       </w:r>
     </w:p>
     <w:p>
@@ -2646,7 +2646,7 @@
         <w:t xml:space="preserve"> </w:t>
       </w:r>
       <w:r>
-        <w:t xml:space="preserve">B.</w:t>
+        <w:t xml:space="preserve">D.</w:t>
       </w:r>
     </w:p>
     <w:p>
@@ -2864,7 +2864,7 @@
         </w:numPr>
       </w:pPr>
       <w:r>
-        <w:t xml:space="preserve">Overlap of n-grams between a candidate and a reference</w:t>
+        <w:t xml:space="preserve">Latency</w:t>
       </w:r>
     </w:p>
     <w:p>
@@ -2885,7 +2885,7 @@
         </w:numPr>
       </w:pPr>
       <w:r>
-        <w:t xml:space="preserve">Toxicity</w:t>
+        <w:t xml:space="preserve">Overlap of n-grams between a candidate and a reference</w:t>
       </w:r>
     </w:p>
     <w:p>
@@ -2906,7 +2906,7 @@
         </w:numPr>
       </w:pPr>
       <w:r>
-        <w:t xml:space="preserve">Latency</w:t>
+        <w:t xml:space="preserve">Toxicity</w:t>
       </w:r>
     </w:p>
     <w:p>
@@ -2924,7 +2924,7 @@
         <w:t xml:space="preserve"> </w:t>
       </w:r>
       <w:r>
-        <w:t xml:space="preserve">B. It does not measure truth.</w:t>
+        <w:t xml:space="preserve">C. It does not measure truth.</w:t>
       </w:r>
     </w:p>
     <w:p>
@@ -3167,7 +3167,7 @@
         </w:numPr>
       </w:pPr>
       <w:r>
-        <w:t xml:space="preserve">Finished requests leave the batch and new ones join at once</w:t>
+        <w:t xml:space="preserve">It reduces the model size</w:t>
       </w:r>
     </w:p>
     <w:p>
@@ -3188,7 +3188,7 @@
         </w:numPr>
       </w:pPr>
       <w:r>
-        <w:t xml:space="preserve">It makes each request faster</w:t>
+        <w:t xml:space="preserve">It removes the KV cache</w:t>
       </w:r>
     </w:p>
     <w:p>
@@ -3209,7 +3209,7 @@
         </w:numPr>
       </w:pPr>
       <w:r>
-        <w:t xml:space="preserve">It reduces the model size</w:t>
+        <w:t xml:space="preserve">It makes each request faster</w:t>
       </w:r>
     </w:p>
     <w:p>
@@ -3230,7 +3230,7 @@
         </w:numPr>
       </w:pPr>
       <w:r>
-        <w:t xml:space="preserve">It removes the KV cache</w:t>
+        <w:t xml:space="preserve">Finished requests leave the batch and new ones join at once</w:t>
       </w:r>
     </w:p>
     <w:p>
@@ -3248,7 +3248,7 @@
         <w:t xml:space="preserve"> </w:t>
       </w:r>
       <w:r>
-        <w:t xml:space="preserve">A.</w:t>
+        <w:t xml:space="preserve">D.</w:t>
       </w:r>
     </w:p>
     <w:p>

</xml_diff>